<commit_message>
Fix test_invalid_url assertion to 400
</commit_message>
<xml_diff>
--- a/devops lab mid(036).docx
+++ b/devops lab mid(036).docx
@@ -476,6 +476,9 @@
     </w:p>
     <w:p>
       <w:r>
+        <w:rPr>
+          <w:noProof/>
+        </w:rPr>
         <w:drawing>
           <wp:inline distT="0" distB="0" distL="0" distR="0" wp14:anchorId="68BFA4F5" wp14:editId="1D5BF364">
             <wp:extent cx="5781482" cy="3252084"/>
@@ -540,6 +543,9 @@
         <w:t>:</w:t>
       </w:r>
       <w:r>
+        <w:rPr>
+          <w:noProof/>
+        </w:rPr>
         <w:drawing>
           <wp:inline distT="0" distB="0" distL="0" distR="0" wp14:anchorId="76A94CC5" wp14:editId="78111F2B">
             <wp:extent cx="6186115" cy="3479690"/>
@@ -725,6 +731,9 @@
         <w:t>Local Receiver &amp; SSH Tunnel Terminal:</w:t>
       </w:r>
       <w:r>
+        <w:rPr>
+          <w:noProof/>
+        </w:rPr>
         <w:drawing>
           <wp:inline distT="0" distB="0" distL="0" distR="0" wp14:anchorId="267BB10D" wp14:editId="31CBB1EB">
             <wp:extent cx="6431719" cy="3617843"/>
@@ -884,6 +893,9 @@
     </w:p>
     <w:p>
       <w:r>
+        <w:rPr>
+          <w:noProof/>
+        </w:rPr>
         <w:drawing>
           <wp:inline distT="0" distB="0" distL="0" distR="0" wp14:anchorId="00241AEB" wp14:editId="7BB08CC4">
             <wp:extent cx="6304501" cy="3546282"/>
@@ -937,6 +949,9 @@
         <w:t>Detailed Pipeline Execution:</w:t>
       </w:r>
       <w:r>
+        <w:rPr>
+          <w:noProof/>
+        </w:rPr>
         <w:drawing>
           <wp:inline distT="0" distB="0" distL="0" distR="0" wp14:anchorId="519E71D9" wp14:editId="75E2D3CD">
             <wp:extent cx="6304501" cy="3546282"/>
@@ -1125,6 +1140,9 @@
     </w:p>
     <w:p>
       <w:r>
+        <w:rPr>
+          <w:noProof/>
+        </w:rPr>
         <w:drawing>
           <wp:inline distT="0" distB="0" distL="0" distR="0" wp14:anchorId="39080618" wp14:editId="6C0ADBEF">
             <wp:extent cx="5625989" cy="3164619"/>
@@ -1179,6 +1197,9 @@
     </w:p>
     <w:p>
       <w:r>
+        <w:rPr>
+          <w:noProof/>
+        </w:rPr>
         <w:drawing>
           <wp:inline distT="0" distB="0" distL="0" distR="0" wp14:anchorId="2D76BA5B" wp14:editId="358B4DEB">
             <wp:extent cx="5327374" cy="2996648"/>
@@ -1256,10 +1277,10 @@
     <w:p>
       <w:r>
         <w:drawing>
-          <wp:inline distT="0" distB="0" distL="0" distR="0" wp14:anchorId="1F193316" wp14:editId="7E587456">
-            <wp:extent cx="5943600" cy="1738630"/>
-            <wp:effectExtent l="0" t="0" r="0" b="0"/>
-            <wp:docPr id="697109159" name="Picture 1"/>
+          <wp:inline distT="0" distB="0" distL="0" distR="0" wp14:anchorId="569D411E" wp14:editId="25639899">
+            <wp:extent cx="5943600" cy="1784350"/>
+            <wp:effectExtent l="0" t="0" r="0" b="6350"/>
+            <wp:docPr id="585867938" name="Picture 1"/>
             <wp:cNvGraphicFramePr>
               <a:graphicFrameLocks xmlns:a="http://schemas.openxmlformats.org/drawingml/2006/main" noChangeAspect="1"/>
             </wp:cNvGraphicFramePr>
@@ -1267,7 +1288,7 @@
               <a:graphicData uri="http://schemas.openxmlformats.org/drawingml/2006/picture">
                 <pic:pic xmlns:pic="http://schemas.openxmlformats.org/drawingml/2006/picture">
                   <pic:nvPicPr>
-                    <pic:cNvPr id="697109159" name=""/>
+                    <pic:cNvPr id="585867938" name=""/>
                     <pic:cNvPicPr/>
                   </pic:nvPicPr>
                   <pic:blipFill>
@@ -1279,7 +1300,52 @@
                   <pic:spPr>
                     <a:xfrm>
                       <a:off x="0" y="0"/>
-                      <a:ext cx="5943600" cy="1738630"/>
+                      <a:ext cx="5943600" cy="1784350"/>
+                    </a:xfrm>
+                    <a:prstGeom prst="rect">
+                      <a:avLst/>
+                    </a:prstGeom>
+                  </pic:spPr>
+                </pic:pic>
+              </a:graphicData>
+            </a:graphic>
+          </wp:inline>
+        </w:drawing>
+      </w:r>
+    </w:p>
+    <w:p/>
+    <w:p>
+      <w:r>
+        <w:t>Bonus task 2:</w:t>
+      </w:r>
+    </w:p>
+    <w:p>
+      <w:r>
+        <w:drawing>
+          <wp:inline distT="0" distB="0" distL="0" distR="0" wp14:anchorId="2EE49C6D" wp14:editId="4BBA3F59">
+            <wp:extent cx="5943600" cy="3343275"/>
+            <wp:effectExtent l="0" t="0" r="0" b="9525"/>
+            <wp:docPr id="451143571" name="Picture 1"/>
+            <wp:cNvGraphicFramePr>
+              <a:graphicFrameLocks xmlns:a="http://schemas.openxmlformats.org/drawingml/2006/main" noChangeAspect="1"/>
+            </wp:cNvGraphicFramePr>
+            <a:graphic xmlns:a="http://schemas.openxmlformats.org/drawingml/2006/main">
+              <a:graphicData uri="http://schemas.openxmlformats.org/drawingml/2006/picture">
+                <pic:pic xmlns:pic="http://schemas.openxmlformats.org/drawingml/2006/picture">
+                  <pic:nvPicPr>
+                    <pic:cNvPr id="451143571" name=""/>
+                    <pic:cNvPicPr/>
+                  </pic:nvPicPr>
+                  <pic:blipFill>
+                    <a:blip r:embed="rId14"/>
+                    <a:stretch>
+                      <a:fillRect/>
+                    </a:stretch>
+                  </pic:blipFill>
+                  <pic:spPr>
+                    <a:xfrm>
+                      <a:off x="0" y="0"/>
+                      <a:ext cx="5943600" cy="3343275"/>
                     </a:xfrm>
                     <a:prstGeom prst="rect">
                       <a:avLst/>
@@ -2062,6 +2128,7 @@
   <w:style w:type="character" w:default="1" w:styleId="DefaultParagraphFont">
     <w:name w:val="Default Paragraph Font"/>
     <w:uiPriority w:val="1"/>
+    <w:semiHidden/>
     <w:unhideWhenUsed/>
   </w:style>
   <w:style w:type="table" w:default="1" w:styleId="TableNormal">

</xml_diff>